<commit_message>
feat(dashboard): add test quality trends
</commit_message>
<xml_diff>
--- a/docs/ATEP_Volume_X_Dashboard_Engineering_Workbook.docx
+++ b/docs/ATEP_Volume_X_Dashboard_Engineering_Workbook.docx
@@ -19,12 +19,12 @@
         <w:rPr>
           <w:b/>
         </w:rPr>
-        <w:t>Version 0.1.0  Dashboard Foundation</w:t>
+        <w:t>Version 0.2.0  Test Quality Trends</w:t>
       </w:r>
     </w:p>
     <w:p>
       <w:r>
-        <w:t>This workbook records X-1, the first governed dashboard read model. It consolidates test execution, quality, automation, mutation, and AI evidence into a stable FastAPI contract without duplicating source data or introducing a paid service, model, or GPU.</w:t>
+        <w:t>This workbook records X-1 and X-2. The governed dashboard read model now consolidates platform KPIs, complete UTC test-quality trends, and a bounded failed-case drill-down without duplicating source data or introducing a paid service, model, or GPU.</w:t>
       </w:r>
     </w:p>
     <w:tbl>
@@ -96,7 +96,7 @@
           </w:tcPr>
           <w:p>
             <w:r>
-              <w:t>X-1 complete</w:t>
+              <w:t>X-1 and X-2 complete</w:t>
             </w:r>
           </w:p>
         </w:tc>
@@ -208,7 +208,7 @@
           </w:tcPr>
           <w:p>
             <w:r>
-              <w:t>X-2 test quality trends and failure drill-down</w:t>
+              <w:t>X-3 vehicle ECU CAN and diagnostics views</w:t>
             </w:r>
           </w:p>
         </w:tc>
@@ -1108,7 +1108,323 @@
         <w:pStyle w:val="Heading1"/>
       </w:pPr>
       <w:r>
-        <w:t>5 Test Catalogue</w:t>
+        <w:t>5 Test Quality Trends and Failure Drill Down</w:t>
+      </w:r>
+    </w:p>
+    <w:p>
+      <w:r>
+        <w:t>The trends contract emits one point for every UTC day in the requested 1 to 90 day window, including zero-activity days. The failure contract exposes only failed case results, supports suite and time filtering, and keeps navigation tied to existing run, case, definition, and evidence identifiers.</w:t>
+      </w:r>
+    </w:p>
+    <w:tbl>
+      <w:tblPr>
+        <w:tblStyle w:val="TableGrid"/>
+        <w:tblW w:type="auto" w:w="0"/>
+        <w:tblLook w:firstColumn="1" w:firstRow="1" w:lastColumn="0" w:lastRow="0" w:noHBand="0" w:noVBand="1" w:val="04A0"/>
+      </w:tblPr>
+      <w:tblGrid>
+        <w:gridCol w:w="3360"/>
+        <w:gridCol w:w="3360"/>
+        <w:gridCol w:w="3360"/>
+      </w:tblGrid>
+      <w:tr>
+        <w:trPr>
+          <w:tblHeader w:val="true"/>
+        </w:trPr>
+        <w:tc>
+          <w:tcPr>
+            <w:tcW w:type="dxa" w:w="2088"/>
+            <w:vAlign w:val="center"/>
+            <w:shd w:fill="1F4E78"/>
+          </w:tcPr>
+          <w:p>
+            <w:r>
+              <w:rPr>
+                <w:b/>
+                <w:color w:val="FFFFFF"/>
+              </w:rPr>
+              <w:t>Control</w:t>
+            </w:r>
+          </w:p>
+        </w:tc>
+        <w:tc>
+          <w:tcPr>
+            <w:tcW w:type="dxa" w:w="2592"/>
+            <w:vAlign w:val="center"/>
+            <w:shd w:fill="1F4E78"/>
+          </w:tcPr>
+          <w:p>
+            <w:r>
+              <w:rPr>
+                <w:b/>
+                <w:color w:val="FFFFFF"/>
+              </w:rPr>
+              <w:t>Bound</w:t>
+            </w:r>
+          </w:p>
+        </w:tc>
+        <w:tc>
+          <w:tcPr>
+            <w:tcW w:type="dxa" w:w="5112"/>
+            <w:vAlign w:val="center"/>
+            <w:shd w:fill="1F4E78"/>
+          </w:tcPr>
+          <w:p>
+            <w:r>
+              <w:rPr>
+                <w:b/>
+                <w:color w:val="FFFFFF"/>
+              </w:rPr>
+              <w:t>Engineering purpose</w:t>
+            </w:r>
+          </w:p>
+        </w:tc>
+      </w:tr>
+      <w:tr>
+        <w:trPr>
+          <w:cantSplit/>
+        </w:trPr>
+        <w:tc>
+          <w:tcPr>
+            <w:tcW w:type="dxa" w:w="2088"/>
+            <w:vAlign w:val="center"/>
+          </w:tcPr>
+          <w:p>
+            <w:r>
+              <w:t>Trend window</w:t>
+            </w:r>
+          </w:p>
+        </w:tc>
+        <w:tc>
+          <w:tcPr>
+            <w:tcW w:type="dxa" w:w="2592"/>
+            <w:vAlign w:val="center"/>
+          </w:tcPr>
+          <w:p>
+            <w:r>
+              <w:t>1 to 90 days</w:t>
+            </w:r>
+          </w:p>
+        </w:tc>
+        <w:tc>
+          <w:tcPr>
+            <w:tcW w:type="dxa" w:w="5112"/>
+            <w:vAlign w:val="center"/>
+          </w:tcPr>
+          <w:p>
+            <w:r>
+              <w:t>Bound query work and chart density</w:t>
+            </w:r>
+          </w:p>
+        </w:tc>
+      </w:tr>
+      <w:tr>
+        <w:trPr>
+          <w:cantSplit/>
+        </w:trPr>
+        <w:tc>
+          <w:tcPr>
+            <w:tcW w:type="dxa" w:w="2088"/>
+            <w:vAlign w:val="center"/>
+            <w:shd w:fill="EAF1F8"/>
+          </w:tcPr>
+          <w:p>
+            <w:r>
+              <w:t>Buckets</w:t>
+            </w:r>
+          </w:p>
+        </w:tc>
+        <w:tc>
+          <w:tcPr>
+            <w:tcW w:type="dxa" w:w="2592"/>
+            <w:vAlign w:val="center"/>
+            <w:shd w:fill="EAF1F8"/>
+          </w:tcPr>
+          <w:p>
+            <w:r>
+              <w:t>Complete UTC days</w:t>
+            </w:r>
+          </w:p>
+        </w:tc>
+        <w:tc>
+          <w:tcPr>
+            <w:tcW w:type="dxa" w:w="5112"/>
+            <w:vAlign w:val="center"/>
+            <w:shd w:fill="EAF1F8"/>
+          </w:tcPr>
+          <w:p>
+            <w:r>
+              <w:t>Prevent clients from inventing missing dates</w:t>
+            </w:r>
+          </w:p>
+        </w:tc>
+      </w:tr>
+      <w:tr>
+        <w:trPr>
+          <w:cantSplit/>
+        </w:trPr>
+        <w:tc>
+          <w:tcPr>
+            <w:tcW w:type="dxa" w:w="2088"/>
+            <w:vAlign w:val="center"/>
+          </w:tcPr>
+          <w:p>
+            <w:r>
+              <w:t>Failure window</w:t>
+            </w:r>
+          </w:p>
+        </w:tc>
+        <w:tc>
+          <w:tcPr>
+            <w:tcW w:type="dxa" w:w="2592"/>
+            <w:vAlign w:val="center"/>
+          </w:tcPr>
+          <w:p>
+            <w:r>
+              <w:t>1 to 2160 hours</w:t>
+            </w:r>
+          </w:p>
+        </w:tc>
+        <w:tc>
+          <w:tcPr>
+            <w:tcW w:type="dxa" w:w="5112"/>
+            <w:vAlign w:val="center"/>
+          </w:tcPr>
+          <w:p>
+            <w:r>
+              <w:t>Bound historical investigation</w:t>
+            </w:r>
+          </w:p>
+        </w:tc>
+      </w:tr>
+      <w:tr>
+        <w:trPr>
+          <w:cantSplit/>
+        </w:trPr>
+        <w:tc>
+          <w:tcPr>
+            <w:tcW w:type="dxa" w:w="2088"/>
+            <w:vAlign w:val="center"/>
+            <w:shd w:fill="EAF1F8"/>
+          </w:tcPr>
+          <w:p>
+            <w:r>
+              <w:t>Page</w:t>
+            </w:r>
+          </w:p>
+        </w:tc>
+        <w:tc>
+          <w:tcPr>
+            <w:tcW w:type="dxa" w:w="2592"/>
+            <w:vAlign w:val="center"/>
+            <w:shd w:fill="EAF1F8"/>
+          </w:tcPr>
+          <w:p>
+            <w:r>
+              <w:t>1 to 100 records</w:t>
+            </w:r>
+          </w:p>
+        </w:tc>
+        <w:tc>
+          <w:tcPr>
+            <w:tcW w:type="dxa" w:w="5112"/>
+            <w:vAlign w:val="center"/>
+            <w:shd w:fill="EAF1F8"/>
+          </w:tcPr>
+          <w:p>
+            <w:r>
+              <w:t>Bound response size and rendering work</w:t>
+            </w:r>
+          </w:p>
+        </w:tc>
+      </w:tr>
+      <w:tr>
+        <w:trPr>
+          <w:cantSplit/>
+        </w:trPr>
+        <w:tc>
+          <w:tcPr>
+            <w:tcW w:type="dxa" w:w="2088"/>
+            <w:vAlign w:val="center"/>
+          </w:tcPr>
+          <w:p>
+            <w:r>
+              <w:t>Observation</w:t>
+            </w:r>
+          </w:p>
+        </w:tc>
+        <w:tc>
+          <w:tcPr>
+            <w:tcW w:type="dxa" w:w="2592"/>
+            <w:vAlign w:val="center"/>
+          </w:tcPr>
+          <w:p>
+            <w:r>
+              <w:t>500 characters</w:t>
+            </w:r>
+          </w:p>
+        </w:tc>
+        <w:tc>
+          <w:tcPr>
+            <w:tcW w:type="dxa" w:w="5112"/>
+            <w:vAlign w:val="center"/>
+          </w:tcPr>
+          <w:p>
+            <w:r>
+              <w:t>Minimize explanatory content exposure</w:t>
+            </w:r>
+          </w:p>
+        </w:tc>
+      </w:tr>
+      <w:tr>
+        <w:trPr>
+          <w:cantSplit/>
+        </w:trPr>
+        <w:tc>
+          <w:tcPr>
+            <w:tcW w:type="dxa" w:w="2088"/>
+            <w:vAlign w:val="center"/>
+            <w:shd w:fill="EAF1F8"/>
+          </w:tcPr>
+          <w:p>
+            <w:r>
+              <w:t>Evidence</w:t>
+            </w:r>
+          </w:p>
+        </w:tc>
+        <w:tc>
+          <w:tcPr>
+            <w:tcW w:type="dxa" w:w="2592"/>
+            <w:vAlign w:val="center"/>
+            <w:shd w:fill="EAF1F8"/>
+          </w:tcPr>
+          <w:p>
+            <w:r>
+              <w:t>Stored references</w:t>
+            </w:r>
+          </w:p>
+        </w:tc>
+        <w:tc>
+          <w:tcPr>
+            <w:tcW w:type="dxa" w:w="5112"/>
+            <w:vAlign w:val="center"/>
+            <w:shd w:fill="EAF1F8"/>
+          </w:tcPr>
+          <w:p>
+            <w:r>
+              <w:t>Preserve drill-down traceability</w:t>
+            </w:r>
+          </w:p>
+        </w:tc>
+      </w:tr>
+    </w:tbl>
+    <w:p/>
+    <w:p>
+      <w:pPr>
+        <w:pStyle w:val="Heading1"/>
+      </w:pPr>
+      <w:r>
+        <w:t>6 Test Catalogue</w:t>
       </w:r>
     </w:p>
     <w:tbl>
@@ -1382,6 +1698,62 @@
           </w:p>
         </w:tc>
       </w:tr>
+      <w:tr>
+        <w:trPr>
+          <w:cantSplit/>
+        </w:trPr>
+        <w:tc>
+          <w:tcPr>
+            <w:tcW w:type="dxa" w:w="2880"/>
+            <w:vAlign w:val="center"/>
+          </w:tcPr>
+          <w:p>
+            <w:r>
+              <w:t>UTC buckets</w:t>
+            </w:r>
+          </w:p>
+        </w:tc>
+        <w:tc>
+          <w:tcPr>
+            <w:tcW w:type="dxa" w:w="6912"/>
+            <w:vAlign w:val="center"/>
+          </w:tcPr>
+          <w:p>
+            <w:r>
+              <w:t>Verify ordering, empty days, outcome totals, and truthful rates</w:t>
+            </w:r>
+          </w:p>
+        </w:tc>
+      </w:tr>
+      <w:tr>
+        <w:trPr>
+          <w:cantSplit/>
+        </w:trPr>
+        <w:tc>
+          <w:tcPr>
+            <w:tcW w:type="dxa" w:w="2880"/>
+            <w:vAlign w:val="center"/>
+            <w:shd w:fill="EAF1F8"/>
+          </w:tcPr>
+          <w:p>
+            <w:r>
+              <w:t>Failure mapping</w:t>
+            </w:r>
+          </w:p>
+        </w:tc>
+        <w:tc>
+          <w:tcPr>
+            <w:tcW w:type="dxa" w:w="6912"/>
+            <w:vAlign w:val="center"/>
+            <w:shd w:fill="EAF1F8"/>
+          </w:tcPr>
+          <w:p>
+            <w:r>
+              <w:t>Verify pagination, filters, references, and observation truncation</w:t>
+            </w:r>
+          </w:p>
+        </w:tc>
+      </w:tr>
     </w:tbl>
     <w:p/>
     <w:p>
@@ -1389,7 +1761,7 @@
         <w:pStyle w:val="Heading1"/>
       </w:pPr>
       <w:r>
-        <w:t>6 Risks Decisions and Technical Debt</w:t>
+        <w:t>7 Risks Decisions and Technical Debt</w:t>
       </w:r>
     </w:p>
     <w:tbl>
@@ -1518,7 +1890,7 @@
           </w:tcPr>
           <w:p>
             <w:r>
-              <w:t>Not included in X-1</w:t>
+              <w:t>Bounded daily buckets</w:t>
             </w:r>
           </w:p>
         </w:tc>
@@ -1530,7 +1902,7 @@
           </w:tcPr>
           <w:p>
             <w:r>
-              <w:t>Add bounded buckets in X-2</w:t>
+              <w:t>Add comparison baselines if justified</w:t>
             </w:r>
           </w:p>
         </w:tc>
@@ -1659,12 +2031,12 @@
         <w:pStyle w:val="Heading1"/>
       </w:pPr>
       <w:r>
-        <w:t>7 Cost and Resource Profile</w:t>
+        <w:t>8 Cost and Resource Profile</w:t>
       </w:r>
     </w:p>
     <w:p>
       <w:r>
-        <w:t>X-1 reuses the local FastAPI and PostgreSQL stack. It requires no AWS account, paid API, external AI provider, model download, or GPU. The automated tests use small deterministic fixtures and bounded database checks, making the increment appropriate for the current Windows and Docker development environment.</w:t>
+        <w:t>X-1 and X-2 reuse the local FastAPI and PostgreSQL stack. They require no AWS account, paid API, external AI provider, model download, or GPU. The automated tests use small deterministic fixtures and bounded database checks, making the increment appropriate for the current Windows and Docker development environment.</w:t>
       </w:r>
     </w:p>
     <w:p>
@@ -1672,12 +2044,12 @@
         <w:pStyle w:val="Heading1"/>
       </w:pPr>
       <w:r>
-        <w:t>8 Next Planned Increment</w:t>
+        <w:t>9 Next Planned Increment</w:t>
       </w:r>
     </w:p>
     <w:p>
       <w:r>
-        <w:t>X-2 will add time-bucketed test quality trends and a bounded failure drill-down contract. It will reference existing test runs, case results, and artifacts without copying raw evidence into the dashboard domain.</w:t>
+        <w:t>X-3 will add bounded operational views for vehicles, ECUs, CAN networks, and diagnostics. Each view will reference authoritative domain records without copying operational state into the dashboard domain.</w:t>
       </w:r>
     </w:p>
     <w:sectPr>

</xml_diff>

<commit_message>
feat(dashboard): add test quality trends (#106)
</commit_message>
<xml_diff>
--- a/docs/ATEP_Volume_X_Dashboard_Engineering_Workbook.docx
+++ b/docs/ATEP_Volume_X_Dashboard_Engineering_Workbook.docx
@@ -19,12 +19,12 @@
         <w:rPr>
           <w:b/>
         </w:rPr>
-        <w:t>Version 0.1.0  Dashboard Foundation</w:t>
+        <w:t>Version 0.2.0  Test Quality Trends</w:t>
       </w:r>
     </w:p>
     <w:p>
       <w:r>
-        <w:t>This workbook records X-1, the first governed dashboard read model. It consolidates test execution, quality, automation, mutation, and AI evidence into a stable FastAPI contract without duplicating source data or introducing a paid service, model, or GPU.</w:t>
+        <w:t>This workbook records X-1 and X-2. The governed dashboard read model now consolidates platform KPIs, complete UTC test-quality trends, and a bounded failed-case drill-down without duplicating source data or introducing a paid service, model, or GPU.</w:t>
       </w:r>
     </w:p>
     <w:tbl>
@@ -96,7 +96,7 @@
           </w:tcPr>
           <w:p>
             <w:r>
-              <w:t>X-1 complete</w:t>
+              <w:t>X-1 and X-2 complete</w:t>
             </w:r>
           </w:p>
         </w:tc>
@@ -208,7 +208,7 @@
           </w:tcPr>
           <w:p>
             <w:r>
-              <w:t>X-2 test quality trends and failure drill-down</w:t>
+              <w:t>X-3 vehicle ECU CAN and diagnostics views</w:t>
             </w:r>
           </w:p>
         </w:tc>
@@ -1108,7 +1108,323 @@
         <w:pStyle w:val="Heading1"/>
       </w:pPr>
       <w:r>
-        <w:t>5 Test Catalogue</w:t>
+        <w:t>5 Test Quality Trends and Failure Drill Down</w:t>
+      </w:r>
+    </w:p>
+    <w:p>
+      <w:r>
+        <w:t>The trends contract emits one point for every UTC day in the requested 1 to 90 day window, including zero-activity days. The failure contract exposes only failed case results, supports suite and time filtering, and keeps navigation tied to existing run, case, definition, and evidence identifiers.</w:t>
+      </w:r>
+    </w:p>
+    <w:tbl>
+      <w:tblPr>
+        <w:tblStyle w:val="TableGrid"/>
+        <w:tblW w:type="auto" w:w="0"/>
+        <w:tblLook w:firstColumn="1" w:firstRow="1" w:lastColumn="0" w:lastRow="0" w:noHBand="0" w:noVBand="1" w:val="04A0"/>
+      </w:tblPr>
+      <w:tblGrid>
+        <w:gridCol w:w="3360"/>
+        <w:gridCol w:w="3360"/>
+        <w:gridCol w:w="3360"/>
+      </w:tblGrid>
+      <w:tr>
+        <w:trPr>
+          <w:tblHeader w:val="true"/>
+        </w:trPr>
+        <w:tc>
+          <w:tcPr>
+            <w:tcW w:type="dxa" w:w="2088"/>
+            <w:vAlign w:val="center"/>
+            <w:shd w:fill="1F4E78"/>
+          </w:tcPr>
+          <w:p>
+            <w:r>
+              <w:rPr>
+                <w:b/>
+                <w:color w:val="FFFFFF"/>
+              </w:rPr>
+              <w:t>Control</w:t>
+            </w:r>
+          </w:p>
+        </w:tc>
+        <w:tc>
+          <w:tcPr>
+            <w:tcW w:type="dxa" w:w="2592"/>
+            <w:vAlign w:val="center"/>
+            <w:shd w:fill="1F4E78"/>
+          </w:tcPr>
+          <w:p>
+            <w:r>
+              <w:rPr>
+                <w:b/>
+                <w:color w:val="FFFFFF"/>
+              </w:rPr>
+              <w:t>Bound</w:t>
+            </w:r>
+          </w:p>
+        </w:tc>
+        <w:tc>
+          <w:tcPr>
+            <w:tcW w:type="dxa" w:w="5112"/>
+            <w:vAlign w:val="center"/>
+            <w:shd w:fill="1F4E78"/>
+          </w:tcPr>
+          <w:p>
+            <w:r>
+              <w:rPr>
+                <w:b/>
+                <w:color w:val="FFFFFF"/>
+              </w:rPr>
+              <w:t>Engineering purpose</w:t>
+            </w:r>
+          </w:p>
+        </w:tc>
+      </w:tr>
+      <w:tr>
+        <w:trPr>
+          <w:cantSplit/>
+        </w:trPr>
+        <w:tc>
+          <w:tcPr>
+            <w:tcW w:type="dxa" w:w="2088"/>
+            <w:vAlign w:val="center"/>
+          </w:tcPr>
+          <w:p>
+            <w:r>
+              <w:t>Trend window</w:t>
+            </w:r>
+          </w:p>
+        </w:tc>
+        <w:tc>
+          <w:tcPr>
+            <w:tcW w:type="dxa" w:w="2592"/>
+            <w:vAlign w:val="center"/>
+          </w:tcPr>
+          <w:p>
+            <w:r>
+              <w:t>1 to 90 days</w:t>
+            </w:r>
+          </w:p>
+        </w:tc>
+        <w:tc>
+          <w:tcPr>
+            <w:tcW w:type="dxa" w:w="5112"/>
+            <w:vAlign w:val="center"/>
+          </w:tcPr>
+          <w:p>
+            <w:r>
+              <w:t>Bound query work and chart density</w:t>
+            </w:r>
+          </w:p>
+        </w:tc>
+      </w:tr>
+      <w:tr>
+        <w:trPr>
+          <w:cantSplit/>
+        </w:trPr>
+        <w:tc>
+          <w:tcPr>
+            <w:tcW w:type="dxa" w:w="2088"/>
+            <w:vAlign w:val="center"/>
+            <w:shd w:fill="EAF1F8"/>
+          </w:tcPr>
+          <w:p>
+            <w:r>
+              <w:t>Buckets</w:t>
+            </w:r>
+          </w:p>
+        </w:tc>
+        <w:tc>
+          <w:tcPr>
+            <w:tcW w:type="dxa" w:w="2592"/>
+            <w:vAlign w:val="center"/>
+            <w:shd w:fill="EAF1F8"/>
+          </w:tcPr>
+          <w:p>
+            <w:r>
+              <w:t>Complete UTC days</w:t>
+            </w:r>
+          </w:p>
+        </w:tc>
+        <w:tc>
+          <w:tcPr>
+            <w:tcW w:type="dxa" w:w="5112"/>
+            <w:vAlign w:val="center"/>
+            <w:shd w:fill="EAF1F8"/>
+          </w:tcPr>
+          <w:p>
+            <w:r>
+              <w:t>Prevent clients from inventing missing dates</w:t>
+            </w:r>
+          </w:p>
+        </w:tc>
+      </w:tr>
+      <w:tr>
+        <w:trPr>
+          <w:cantSplit/>
+        </w:trPr>
+        <w:tc>
+          <w:tcPr>
+            <w:tcW w:type="dxa" w:w="2088"/>
+            <w:vAlign w:val="center"/>
+          </w:tcPr>
+          <w:p>
+            <w:r>
+              <w:t>Failure window</w:t>
+            </w:r>
+          </w:p>
+        </w:tc>
+        <w:tc>
+          <w:tcPr>
+            <w:tcW w:type="dxa" w:w="2592"/>
+            <w:vAlign w:val="center"/>
+          </w:tcPr>
+          <w:p>
+            <w:r>
+              <w:t>1 to 2160 hours</w:t>
+            </w:r>
+          </w:p>
+        </w:tc>
+        <w:tc>
+          <w:tcPr>
+            <w:tcW w:type="dxa" w:w="5112"/>
+            <w:vAlign w:val="center"/>
+          </w:tcPr>
+          <w:p>
+            <w:r>
+              <w:t>Bound historical investigation</w:t>
+            </w:r>
+          </w:p>
+        </w:tc>
+      </w:tr>
+      <w:tr>
+        <w:trPr>
+          <w:cantSplit/>
+        </w:trPr>
+        <w:tc>
+          <w:tcPr>
+            <w:tcW w:type="dxa" w:w="2088"/>
+            <w:vAlign w:val="center"/>
+            <w:shd w:fill="EAF1F8"/>
+          </w:tcPr>
+          <w:p>
+            <w:r>
+              <w:t>Page</w:t>
+            </w:r>
+          </w:p>
+        </w:tc>
+        <w:tc>
+          <w:tcPr>
+            <w:tcW w:type="dxa" w:w="2592"/>
+            <w:vAlign w:val="center"/>
+            <w:shd w:fill="EAF1F8"/>
+          </w:tcPr>
+          <w:p>
+            <w:r>
+              <w:t>1 to 100 records</w:t>
+            </w:r>
+          </w:p>
+        </w:tc>
+        <w:tc>
+          <w:tcPr>
+            <w:tcW w:type="dxa" w:w="5112"/>
+            <w:vAlign w:val="center"/>
+            <w:shd w:fill="EAF1F8"/>
+          </w:tcPr>
+          <w:p>
+            <w:r>
+              <w:t>Bound response size and rendering work</w:t>
+            </w:r>
+          </w:p>
+        </w:tc>
+      </w:tr>
+      <w:tr>
+        <w:trPr>
+          <w:cantSplit/>
+        </w:trPr>
+        <w:tc>
+          <w:tcPr>
+            <w:tcW w:type="dxa" w:w="2088"/>
+            <w:vAlign w:val="center"/>
+          </w:tcPr>
+          <w:p>
+            <w:r>
+              <w:t>Observation</w:t>
+            </w:r>
+          </w:p>
+        </w:tc>
+        <w:tc>
+          <w:tcPr>
+            <w:tcW w:type="dxa" w:w="2592"/>
+            <w:vAlign w:val="center"/>
+          </w:tcPr>
+          <w:p>
+            <w:r>
+              <w:t>500 characters</w:t>
+            </w:r>
+          </w:p>
+        </w:tc>
+        <w:tc>
+          <w:tcPr>
+            <w:tcW w:type="dxa" w:w="5112"/>
+            <w:vAlign w:val="center"/>
+          </w:tcPr>
+          <w:p>
+            <w:r>
+              <w:t>Minimize explanatory content exposure</w:t>
+            </w:r>
+          </w:p>
+        </w:tc>
+      </w:tr>
+      <w:tr>
+        <w:trPr>
+          <w:cantSplit/>
+        </w:trPr>
+        <w:tc>
+          <w:tcPr>
+            <w:tcW w:type="dxa" w:w="2088"/>
+            <w:vAlign w:val="center"/>
+            <w:shd w:fill="EAF1F8"/>
+          </w:tcPr>
+          <w:p>
+            <w:r>
+              <w:t>Evidence</w:t>
+            </w:r>
+          </w:p>
+        </w:tc>
+        <w:tc>
+          <w:tcPr>
+            <w:tcW w:type="dxa" w:w="2592"/>
+            <w:vAlign w:val="center"/>
+            <w:shd w:fill="EAF1F8"/>
+          </w:tcPr>
+          <w:p>
+            <w:r>
+              <w:t>Stored references</w:t>
+            </w:r>
+          </w:p>
+        </w:tc>
+        <w:tc>
+          <w:tcPr>
+            <w:tcW w:type="dxa" w:w="5112"/>
+            <w:vAlign w:val="center"/>
+            <w:shd w:fill="EAF1F8"/>
+          </w:tcPr>
+          <w:p>
+            <w:r>
+              <w:t>Preserve drill-down traceability</w:t>
+            </w:r>
+          </w:p>
+        </w:tc>
+      </w:tr>
+    </w:tbl>
+    <w:p/>
+    <w:p>
+      <w:pPr>
+        <w:pStyle w:val="Heading1"/>
+      </w:pPr>
+      <w:r>
+        <w:t>6 Test Catalogue</w:t>
       </w:r>
     </w:p>
     <w:tbl>
@@ -1382,6 +1698,62 @@
           </w:p>
         </w:tc>
       </w:tr>
+      <w:tr>
+        <w:trPr>
+          <w:cantSplit/>
+        </w:trPr>
+        <w:tc>
+          <w:tcPr>
+            <w:tcW w:type="dxa" w:w="2880"/>
+            <w:vAlign w:val="center"/>
+          </w:tcPr>
+          <w:p>
+            <w:r>
+              <w:t>UTC buckets</w:t>
+            </w:r>
+          </w:p>
+        </w:tc>
+        <w:tc>
+          <w:tcPr>
+            <w:tcW w:type="dxa" w:w="6912"/>
+            <w:vAlign w:val="center"/>
+          </w:tcPr>
+          <w:p>
+            <w:r>
+              <w:t>Verify ordering, empty days, outcome totals, and truthful rates</w:t>
+            </w:r>
+          </w:p>
+        </w:tc>
+      </w:tr>
+      <w:tr>
+        <w:trPr>
+          <w:cantSplit/>
+        </w:trPr>
+        <w:tc>
+          <w:tcPr>
+            <w:tcW w:type="dxa" w:w="2880"/>
+            <w:vAlign w:val="center"/>
+            <w:shd w:fill="EAF1F8"/>
+          </w:tcPr>
+          <w:p>
+            <w:r>
+              <w:t>Failure mapping</w:t>
+            </w:r>
+          </w:p>
+        </w:tc>
+        <w:tc>
+          <w:tcPr>
+            <w:tcW w:type="dxa" w:w="6912"/>
+            <w:vAlign w:val="center"/>
+            <w:shd w:fill="EAF1F8"/>
+          </w:tcPr>
+          <w:p>
+            <w:r>
+              <w:t>Verify pagination, filters, references, and observation truncation</w:t>
+            </w:r>
+          </w:p>
+        </w:tc>
+      </w:tr>
     </w:tbl>
     <w:p/>
     <w:p>
@@ -1389,7 +1761,7 @@
         <w:pStyle w:val="Heading1"/>
       </w:pPr>
       <w:r>
-        <w:t>6 Risks Decisions and Technical Debt</w:t>
+        <w:t>7 Risks Decisions and Technical Debt</w:t>
       </w:r>
     </w:p>
     <w:tbl>
@@ -1518,7 +1890,7 @@
           </w:tcPr>
           <w:p>
             <w:r>
-              <w:t>Not included in X-1</w:t>
+              <w:t>Bounded daily buckets</w:t>
             </w:r>
           </w:p>
         </w:tc>
@@ -1530,7 +1902,7 @@
           </w:tcPr>
           <w:p>
             <w:r>
-              <w:t>Add bounded buckets in X-2</w:t>
+              <w:t>Add comparison baselines if justified</w:t>
             </w:r>
           </w:p>
         </w:tc>
@@ -1659,12 +2031,12 @@
         <w:pStyle w:val="Heading1"/>
       </w:pPr>
       <w:r>
-        <w:t>7 Cost and Resource Profile</w:t>
+        <w:t>8 Cost and Resource Profile</w:t>
       </w:r>
     </w:p>
     <w:p>
       <w:r>
-        <w:t>X-1 reuses the local FastAPI and PostgreSQL stack. It requires no AWS account, paid API, external AI provider, model download, or GPU. The automated tests use small deterministic fixtures and bounded database checks, making the increment appropriate for the current Windows and Docker development environment.</w:t>
+        <w:t>X-1 and X-2 reuse the local FastAPI and PostgreSQL stack. They require no AWS account, paid API, external AI provider, model download, or GPU. The automated tests use small deterministic fixtures and bounded database checks, making the increment appropriate for the current Windows and Docker development environment.</w:t>
       </w:r>
     </w:p>
     <w:p>
@@ -1672,12 +2044,12 @@
         <w:pStyle w:val="Heading1"/>
       </w:pPr>
       <w:r>
-        <w:t>8 Next Planned Increment</w:t>
+        <w:t>9 Next Planned Increment</w:t>
       </w:r>
     </w:p>
     <w:p>
       <w:r>
-        <w:t>X-2 will add time-bucketed test quality trends and a bounded failure drill-down contract. It will reference existing test runs, case results, and artifacts without copying raw evidence into the dashboard domain.</w:t>
+        <w:t>X-3 will add bounded operational views for vehicles, ECUs, CAN networks, and diagnostics. Each view will reference authoritative domain records without copying operational state into the dashboard domain.</w:t>
       </w:r>
     </w:p>
     <w:sectPr>

</xml_diff>